<commit_message>
Polish submission brief differentiators
</commit_message>
<xml_diff>
--- a/docs/Community_Hero_Project_Description.docx
+++ b/docs/Community_Hero_Project_Description.docx
@@ -88,19 +88,118 @@
     <w:p/>
     <w:p>
       <w:r>
-        <w:t>Community Hero is an AI-powered, geofenced civic issue management platform for residential societies, gated communities, campuses, and smart neighborhoods. It helps a community report, verify, track, resolve, and learn from hyperlocal problems such as water leaks, potholes, damaged lights, waste issues, broken infrastructure, and other neighborhood-level concerns.</w:t>
-      </w:r>
-    </w:p>
-    <w:p/>
-    <w:p>
-      <w:r>
-        <w:t>The product is built around the complete lifecycle of a community issue. An admin creates a community boundary using Google Maps, either by selecting a radius around the current location or by manually marking a polygon boundary. Residents can join only when their current GPS location is inside that community boundary. Once approved, residents can report issues with an image, description, and location. Google Gemini analyzes the report, detects spam or invalid uploads when confidence is high, classifies the issue, estimates severity, and supports the duplicate and history system.</w:t>
-      </w:r>
-    </w:p>
-    <w:p/>
-    <w:p>
-      <w:r>
-        <w:t>The platform keeps the workflow fair. Issue creators cannot approve their own reports, and solvers cannot verify their own fixes. More than one resident can collaborate on the same issue, admins can upload direct fixes, and every resolution requires useful proof and a description so the community builds future knowledge instead of only closing tickets.</w:t>
+        <w:t>Community Hero is an AI-powered, geofenced civic operations platform for residential societies, gated communities, campuses, and smart neighborhoods. It transforms local issue reporting from a loosely coordinated chat-based process into a structured, verifiable, and accountable workflow for identifying, validating, resolving, and learning from hyperlocal problems such as water leaks, potholes, damaged lights, waste issues, broken infrastructure, and recurring maintenance failures.</w:t>
+      </w:r>
+    </w:p>
+    <w:p/>
+    <w:p>
+      <w:r>
+        <w:t>The solution is designed around the full operational lifecycle of a civic issue. An admin defines the community boundary using Google Maps, either through a radius-based geofence or a manually marked polygon. Residents can join only after their physical location is verified against that boundary. Once approved, residents can report issues with an image, description, and GPS location. Google Gemini then evaluates the report, classifies the issue, estimates severity, identifies likely causes, flags high-confidence spam or invalid uploads, and supports duplicate detection and historical recommendation workflows.</w:t>
+      </w:r>
+    </w:p>
+    <w:p/>
+    <w:p>
+      <w:r>
+        <w:t>Community Hero also addresses the trust and accountability gaps that usually prevent local reporting systems from working well. Issue creators cannot approve their own reports, solvers cannot verify their own fixes, and every resolution requires proof plus a written description. Multiple residents can collaborate on the same issue, admins can directly upload fixes, and resolved issues become reusable community knowledge rather than disappearing as closed tickets.</w:t>
+      </w:r>
+    </w:p>
+    <w:p/>
+    <w:p>
+      <w:pPr>
+        <w:pStyle w:val="Heading1"/>
+      </w:pPr>
+      <w:r>
+        <w:t>Why Community Hero Stands Out</w:t>
+      </w:r>
+    </w:p>
+    <w:p/>
+    <w:p>
+      <w:r>
+        <w:t>Community Hero differentiates itself by treating hyperlocal problem solving as a complete civic operations workflow rather than a simple complaint form. The platform combines location trust, AI-assisted reasoning, community verification, and institutional memory into one cohesive experience.</w:t>
+      </w:r>
+    </w:p>
+    <w:p/>
+    <w:p>
+      <w:r>
+        <w:t>Its key differentiators are:</w:t>
+      </w:r>
+    </w:p>
+    <w:p/>
+    <w:p>
+      <w:pPr>
+        <w:numPr>
+          <w:ilvl w:val="0"/>
+          <w:numId w:val="1"/>
+        </w:numPr>
+      </w:pPr>
+      <w:r>
+        <w:t>Geofence-first trust model: community access, resident login, issue creation, and on-site work are validated against the saved society boundary, reducing fake participation and off-site reporting.</w:t>
+      </w:r>
+    </w:p>
+    <w:p>
+      <w:pPr>
+        <w:numPr>
+          <w:ilvl w:val="0"/>
+          <w:numId w:val="1"/>
+        </w:numPr>
+      </w:pPr>
+      <w:r>
+        <w:t>AI-assisted decision support: Gemini classifies issues, explains risk, compares similarity, and detects high-confidence spam while uncertain cases remain under community review instead of being rejected automatically.</w:t>
+      </w:r>
+    </w:p>
+    <w:p>
+      <w:pPr>
+        <w:numPr>
+          <w:ilvl w:val="0"/>
+          <w:numId w:val="1"/>
+        </w:numPr>
+      </w:pPr>
+      <w:r>
+        <w:t>Duplicate prevention with historical reuse: unresolved duplicate reports are merged to avoid split effort, while resolved similar issues are surfaced as guidance for future incidents.</w:t>
+      </w:r>
+    </w:p>
+    <w:p>
+      <w:pPr>
+        <w:numPr>
+          <w:ilvl w:val="0"/>
+          <w:numId w:val="1"/>
+        </w:numPr>
+      </w:pPr>
+      <w:r>
+        <w:t>Fair community governance: creator self-approval and solver self-verification are blocked, making the workflow more credible for residents, admins, and evaluators.</w:t>
+      </w:r>
+    </w:p>
+    <w:p>
+      <w:pPr>
+        <w:numPr>
+          <w:ilvl w:val="0"/>
+          <w:numId w:val="1"/>
+        </w:numPr>
+      </w:pPr>
+      <w:r>
+        <w:t>Collaborative resolution model: each issue can support a primary solver, multiple helpers, help requests, admin-submitted fixes, resolution proof, and community verification.</w:t>
+      </w:r>
+    </w:p>
+    <w:p>
+      <w:pPr>
+        <w:numPr>
+          <w:ilvl w:val="0"/>
+          <w:numId w:val="1"/>
+        </w:numPr>
+      </w:pPr>
+      <w:r>
+        <w:t>Community memory: useful reports and fixes contribute to future recommendations, maintenance planning, analytics, and resident accountability.</w:t>
+      </w:r>
+    </w:p>
+    <w:p>
+      <w:pPr>
+        <w:numPr>
+          <w:ilvl w:val="0"/>
+          <w:numId w:val="1"/>
+        </w:numPr>
+      </w:pPr>
+      <w:r>
+        <w:t>Production-ready delivery: the React frontend is deployed on Firebase Hosting with SPA route rewrites and GitHub Actions deployment automation.</w:t>
       </w:r>
     </w:p>
     <w:p/>
@@ -390,63 +489,41 @@
         <w:pStyle w:val="Heading1"/>
       </w:pPr>
       <w:r>
-        <w:t>Key Features</w:t>
-      </w:r>
-    </w:p>
-    <w:p/>
-    <w:p>
-      <w:pPr>
-        <w:numPr>
-          <w:ilvl w:val="0"/>
-          <w:numId w:val="1"/>
-        </w:numPr>
-      </w:pPr>
-      <w:r>
-        <w:t>Admin community setup with radius or manually marked polygon geofence.</w:t>
-      </w:r>
-    </w:p>
-    <w:p>
-      <w:pPr>
-        <w:numPr>
-          <w:ilvl w:val="0"/>
-          <w:numId w:val="1"/>
-        </w:numPr>
-      </w:pPr>
-      <w:r>
-        <w:t>Google Maps based community map with society boundary, issue markers, and maintenance markers.</w:t>
-      </w:r>
-    </w:p>
-    <w:p>
-      <w:pPr>
-        <w:numPr>
-          <w:ilvl w:val="0"/>
-          <w:numId w:val="1"/>
-        </w:numPr>
-      </w:pPr>
-      <w:r>
-        <w:t>Resident join requests with GPS verification against the selected society.</w:t>
-      </w:r>
-    </w:p>
-    <w:p>
-      <w:pPr>
-        <w:numPr>
-          <w:ilvl w:val="0"/>
-          <w:numId w:val="1"/>
-        </w:numPr>
-      </w:pPr>
-      <w:r>
-        <w:t>Identity-bound resident login geofence.</w:t>
-      </w:r>
-    </w:p>
-    <w:p>
-      <w:pPr>
-        <w:numPr>
-          <w:ilvl w:val="0"/>
-          <w:numId w:val="1"/>
-        </w:numPr>
-      </w:pPr>
-      <w:r>
-        <w:t>Issue creation with geofence enforcement.</w:t>
+        <w:t>Core Differentiators and Features</w:t>
+      </w:r>
+    </w:p>
+    <w:p/>
+    <w:p>
+      <w:pPr>
+        <w:numPr>
+          <w:ilvl w:val="0"/>
+          <w:numId w:val="1"/>
+        </w:numPr>
+      </w:pPr>
+      <w:r>
+        <w:t>Boundary-aware community setup using either radius-based geofencing or manually marked polygon borders on Google Maps.</w:t>
+      </w:r>
+    </w:p>
+    <w:p>
+      <w:pPr>
+        <w:numPr>
+          <w:ilvl w:val="0"/>
+          <w:numId w:val="1"/>
+        </w:numPr>
+      </w:pPr>
+      <w:r>
+        <w:t>GPS-verified resident onboarding so community membership is tied to physical presence inside the selected society.</w:t>
+      </w:r>
+    </w:p>
+    <w:p>
+      <w:pPr>
+        <w:numPr>
+          <w:ilvl w:val="0"/>
+          <w:numId w:val="1"/>
+        </w:numPr>
+      </w:pPr>
+      <w:r>
+        <w:t>Identity-bound resident login geofencing for approved residents.</w:t>
       </w:r>
     </w:p>
     <w:p>
@@ -468,84 +545,73 @@
         </w:numPr>
       </w:pPr>
       <w:r>
-        <w:t>Gemini-powered image and text analysis for category, severity, root cause, tags, risk, and summary.</w:t>
-      </w:r>
-    </w:p>
-    <w:p>
-      <w:pPr>
-        <w:numPr>
-          <w:ilvl w:val="0"/>
-          <w:numId w:val="1"/>
-        </w:numPr>
-      </w:pPr>
-      <w:r>
-        <w:t>AI safety gates for spam reports, unrelated images, invalid issue proof, invalid resolution proof, and issue-still-present cases.</w:t>
-      </w:r>
-    </w:p>
-    <w:p>
-      <w:pPr>
-        <w:numPr>
-          <w:ilvl w:val="0"/>
-          <w:numId w:val="1"/>
-        </w:numPr>
-      </w:pPr>
-      <w:r>
-        <w:t>Active duplicate detection using spatial, text, image, category, and semantic signals.</w:t>
-      </w:r>
-    </w:p>
-    <w:p>
-      <w:pPr>
-        <w:numPr>
-          <w:ilvl w:val="0"/>
-          <w:numId w:val="1"/>
-        </w:numPr>
-      </w:pPr>
-      <w:r>
-        <w:t>Historical recommendation system for resolved similar issues.</w:t>
-      </w:r>
-    </w:p>
-    <w:p>
-      <w:pPr>
-        <w:numPr>
-          <w:ilvl w:val="0"/>
-          <w:numId w:val="1"/>
-        </w:numPr>
-      </w:pPr>
-      <w:r>
-        <w:t>Community voting for issue approval and resolution verification.</w:t>
-      </w:r>
-    </w:p>
-    <w:p>
-      <w:pPr>
-        <w:numPr>
-          <w:ilvl w:val="0"/>
-          <w:numId w:val="1"/>
-        </w:numPr>
-      </w:pPr>
-      <w:r>
-        <w:t>Fairness rules that block creator self-approval and solver self-verification.</w:t>
-      </w:r>
-    </w:p>
-    <w:p>
-      <w:pPr>
-        <w:numPr>
-          <w:ilvl w:val="0"/>
-          <w:numId w:val="1"/>
-        </w:numPr>
-      </w:pPr>
-      <w:r>
-        <w:t>Multi-helper solving flow with help requests.</w:t>
-      </w:r>
-    </w:p>
-    <w:p>
-      <w:pPr>
-        <w:numPr>
-          <w:ilvl w:val="0"/>
-          <w:numId w:val="1"/>
-        </w:numPr>
-      </w:pPr>
-      <w:r>
-        <w:t>Admin direct fix upload.</w:t>
+        <w:t>Gemini-powered issue understanding across category, severity, root cause, tags, risk, and concise explanations.</w:t>
+      </w:r>
+    </w:p>
+    <w:p>
+      <w:pPr>
+        <w:numPr>
+          <w:ilvl w:val="0"/>
+          <w:numId w:val="1"/>
+        </w:numPr>
+      </w:pPr>
+      <w:r>
+        <w:t>AI safety gates that reject high-confidence spam, unrelated images, invalid issue proof, invalid resolution proof, and issue-still-present cases before they waste community voting effort.</w:t>
+      </w:r>
+    </w:p>
+    <w:p>
+      <w:pPr>
+        <w:numPr>
+          <w:ilvl w:val="0"/>
+          <w:numId w:val="1"/>
+        </w:numPr>
+      </w:pPr>
+      <w:r>
+        <w:t>Hybrid duplicate detection using spatial proximity, text similarity, image comparison, category signals, and Gemini embeddings.</w:t>
+      </w:r>
+    </w:p>
+    <w:p>
+      <w:pPr>
+        <w:numPr>
+          <w:ilvl w:val="0"/>
+          <w:numId w:val="1"/>
+        </w:numPr>
+      </w:pPr>
+      <w:r>
+        <w:t>Historical recommendation system that turns resolved issues into reusable community knowledge without blocking legitimate future reports.</w:t>
+      </w:r>
+    </w:p>
+    <w:p>
+      <w:pPr>
+        <w:numPr>
+          <w:ilvl w:val="0"/>
+          <w:numId w:val="1"/>
+        </w:numPr>
+      </w:pPr>
+      <w:r>
+        <w:t>Community verification for both issue approval and resolution approval.</w:t>
+      </w:r>
+    </w:p>
+    <w:p>
+      <w:pPr>
+        <w:numPr>
+          <w:ilvl w:val="0"/>
+          <w:numId w:val="1"/>
+        </w:numPr>
+      </w:pPr>
+      <w:r>
+        <w:t>Governance rules that block creator self-approval and solver self-verification.</w:t>
+      </w:r>
+    </w:p>
+    <w:p>
+      <w:pPr>
+        <w:numPr>
+          <w:ilvl w:val="0"/>
+          <w:numId w:val="1"/>
+        </w:numPr>
+      </w:pPr>
+      <w:r>
+        <w:t>Multi-helper solving flow with help requests, primary ownership, admin direct fixes, and resolution descriptions.</w:t>
       </w:r>
     </w:p>
     <w:p>
@@ -567,18 +633,18 @@
         </w:numPr>
       </w:pPr>
       <w:r>
-        <w:t>Gamification with points, leaderboard, achievements, and contribution history.</w:t>
-      </w:r>
-    </w:p>
-    <w:p>
-      <w:pPr>
-        <w:numPr>
-          <w:ilvl w:val="0"/>
-          <w:numId w:val="1"/>
-        </w:numPr>
-      </w:pPr>
-      <w:r>
-        <w:t>Dashboard panels for analytics, health score, community knowledge, history, feed, weather, and maintenance.</w:t>
+        <w:t>Gamification with points, leaderboard, achievements, and resident contribution history.</w:t>
+      </w:r>
+    </w:p>
+    <w:p>
+      <w:pPr>
+        <w:numPr>
+          <w:ilvl w:val="0"/>
+          <w:numId w:val="1"/>
+        </w:numPr>
+      </w:pPr>
+      <w:r>
+        <w:t>Operational dashboards for analytics, community health, knowledge, history, feed, weather context, and maintenance planning.</w:t>
       </w:r>
     </w:p>
     <w:p>
@@ -600,7 +666,7 @@
         </w:numPr>
       </w:pPr>
       <w:r>
-        <w:t>Production-ready Firebase Hosting deployment with GitHub Actions automation.</w:t>
+        <w:t>Firebase Hosting deployment with SPA route rewrites and GitHub Actions continuous deployment.</w:t>
       </w:r>
     </w:p>
     <w:p/>
@@ -1508,7 +1574,7 @@
     <w:p/>
     <w:p>
       <w:r>
-        <w:t>Community Hero directly solves fragmented local issue reporting by combining reporting, verification, tracking, resolution, and history in one workflow. It gives residents transparency and gives admins a practical operating view of community problems.</w:t>
+        <w:t>Community Hero directly addresses fragmented local issue reporting by combining reporting, verification, tracking, resolution, and institutional memory in one workflow. It gives residents transparency, gives admins operational control, and reduces the repeated manual coordination that usually happens across chats, calls, and informal complaint registers.</w:t>
       </w:r>
     </w:p>
     <w:p/>
@@ -1520,7 +1586,7 @@
     <w:p/>
     <w:p>
       <w:r>
-        <w:t>Gemini is not used only for labels. It helps reason about images, descriptions, spam risk, severity, root causes, duplicate likelihood, and resolution validity. The system uses that reasoning to route workflow decisions while still avoiding hard rejection when AI confidence is low.</w:t>
+        <w:t>Gemini is not used as a superficial labeling layer. It reasons over issue images, descriptions, spam risk, severity, root causes, duplicate likelihood, and resolution validity. The product uses that reasoning to route workflow decisions while deliberately preserving human/community judgment when AI confidence is low.</w:t>
       </w:r>
     </w:p>
     <w:p/>
@@ -1532,7 +1598,7 @@
     <w:p/>
     <w:p>
       <w:r>
-        <w:t>The platform combines geofencing, AI image reasoning, semantic issue memory, duplicate merging, fair voting rules, collaborative solving, gamification, and historical recommendations into a practical community product.</w:t>
+        <w:t>The platform stands out by combining geofencing, AI image reasoning, semantic issue memory, active duplicate merging, fair voting rules, collaborative solving, gamification, and historical recommendations into a practical community product. The most important innovation is the separation between active duplicates and resolved history: current duplicates are merged, while past solutions become guidance.</w:t>
       </w:r>
     </w:p>
     <w:p/>
@@ -1544,7 +1610,7 @@
     <w:p/>
     <w:p>
       <w:r>
-        <w:t>Gemini, Google embeddings, Google Maps, and Firebase Hosting are core to the product experience. They are used for image understanding, semantic retrieval, duplicate intelligence, geofencing UI, community visualization, and live deployment.</w:t>
+        <w:t>Gemini, Google embeddings, Google Maps, and Firebase Hosting are core to the product experience. They support image understanding, semantic retrieval, duplicate intelligence, geofence creation, community visualization, and live frontend deployment. These integrations are part of the main workflow rather than isolated add-ons.</w:t>
       </w:r>
     </w:p>
     <w:p/>
@@ -1556,7 +1622,7 @@
     <w:p/>
     <w:p>
       <w:r>
-        <w:t>The app has role-specific dashboards, clear community setup, smooth resident onboarding, guided issue creation, active issue tracking, resolution proof, notifications, leaderboard, history, and maintenance workflows.</w:t>
+        <w:t>The app is designed around the daily needs of admins and residents rather than a generic dashboard. It provides role-specific views, guided community setup, smooth resident onboarding, structured issue creation, active issue tracking, resolution proof, notifications, leaderboard, history, and maintenance workflows.</w:t>
       </w:r>
     </w:p>
     <w:p/>
@@ -1568,7 +1634,7 @@
     <w:p/>
     <w:p>
       <w:r>
-        <w:t>The system enforces identity, role, society membership, geofence checks, upload validation, AI gates, duplicate logic, and workflow transitions. The frontend is deployed on Firebase Hosting with production static routing and GitHub Actions automation.</w:t>
+        <w:t>The system enforces identity, role, society membership, geofence checks, upload validation, AI gates, duplicate logic, and workflow transitions across the product. The frontend is deployed on Firebase Hosting with production static routing and GitHub Actions automation.</w:t>
       </w:r>
     </w:p>
     <w:p/>
@@ -1580,7 +1646,7 @@
     <w:p/>
     <w:p>
       <w:r>
-        <w:t>The product supports the full end-to-end journey: create a community, onboard residents, report issues, detect duplicates, approve issues, collaborate on fixes, verify resolutions, show history, and reuse prior knowledge for future problems.</w:t>
+        <w:t>The product supports the full end-to-end journey: create a community, onboard residents, report issues, detect active duplicates, approve issues, collaborate on fixes, verify resolutions, show history, and reuse prior knowledge for future problems. This makes the project evaluation-ready from the deployed frontend instead of requiring manual database setup.</w:t>
       </w:r>
     </w:p>
     <w:p/>
@@ -2088,7 +2154,7 @@
     <w:p/>
     <w:p>
       <w:r>
-        <w:t>Community Hero is designed as a complete hyperlocal problem-solving platform for real communities. It uses Google AI, Google Maps, and Firebase Hosting to make civic issue reporting intelligent, location-aware, collaborative, transparent, and easy to evaluate from a live frontend. The system reduces duplicate effort, verifies problems fairly, supports multi-person resolution, and preserves historical knowledge so communities become better at solving recurring problems over time.</w:t>
+        <w:t>Community Hero is designed as a complete hyperlocal problem-solving platform for real communities. Its value lies in combining trustworthy location boundaries, AI-assisted evidence review, fair community verification, collaborative resolution, and long-term knowledge retention. With Google AI, Google Maps, and Firebase Hosting integrated into the core workflow, the project presents a practical, production-oriented solution for communities that need more than a complaint box: they need a reliable system for turning local problems into verified, resolved, and reusable civic knowledge.</w:t>
       </w:r>
     </w:p>
     <w:sectPr>

</xml_diff>

<commit_message>
Align submission brief with required sections
</commit_message>
<xml_diff>
--- a/docs/Community_Hero_Project_Description.docx
+++ b/docs/Community_Hero_Project_Description.docx
@@ -489,7 +489,7 @@
         <w:pStyle w:val="Heading1"/>
       </w:pPr>
       <w:r>
-        <w:t>Core Differentiators and Features</w:t>
+        <w:t>Key Features and Core Differentiators</w:t>
       </w:r>
     </w:p>
     <w:p/>
@@ -1297,7 +1297,7 @@
         <w:pStyle w:val="Heading1"/>
       </w:pPr>
       <w:r>
-        <w:t>Technology Stack</w:t>
+        <w:t>Technologies Used</w:t>
       </w:r>
     </w:p>
     <w:p/>

</xml_diff>